<commit_message>
docs: update production launch checklist statuses
Mark completed items: §1 git-history secret audit; §3 Stripe live mode
(products/prices/keys/webhook wired + deployed); §4 email deliverability
(SendGrid SMTP, inbox verified). Note remaining pending items.

Co-Authored-By: Claude Opus 4.8 (1M context) <noreply@anthropic.com>
</commit_message>
<xml_diff>
--- a/PRODUCTION_LAUNCH_CHECKLIST.docx
+++ b/PRODUCTION_LAUNCH_CHECKLIST.docx
@@ -30,14 +30,7 @@
     </w:p>
     <w:p>
       <w:r>
-        <w:rPr>
-          <w:rFonts w:ascii="Calibri" w:hAnsi="Calibri"/>
-          <w:b w:val="0"/>
-          <w:i/>
-          <w:color w:val="5F6368"/>
-          <w:sz w:val="20"/>
-        </w:rPr>
-        <w:t>Generated: 2026-06-27</w:t>
+        <w:t>Generated: 2026-06-27   |   Updated: 2026-06-29 (Stripe live wiring shipped; Shopify token dependency removed; git-history audit complete)</w:t>
       </w:r>
     </w:p>
     <w:p>
@@ -388,19 +381,25 @@
           </w:tcPr>
           <w:p>
             <w:r>
-              <w:rPr>
-                <w:rFonts w:ascii="Calibri" w:hAnsi="Calibri"/>
-                <w:b/>
-                <w:color w:val="C5221F"/>
-                <w:sz w:val="22"/>
-              </w:rPr>
-              <w:t>BLOCKER</w:t>
+              <w:t>PARTIAL</w:t>
             </w:r>
           </w:p>
         </w:tc>
         <w:tc>
           <w:tcPr>
             <w:tcW w:type="dxa" w:w="3600"/>
+          </w:tcPr>
+          <w:p>
+            <w:r>
+              <w:t>App no longer uses ANY Shopify token — dependency removed (commit 57da1af) and deployed (api + stripe-webhook v8) on 2026-06-29; PRHOMZ Shop-the-Look now just links to prhomz.com. Token still exists in git history. REMAINING: revoke the leaked token in Shopify Admin (now safe — nothing consumes it). Optional: strip the unused SHOPIFY_ACCESS_TOKEN secret binding from cloud_run.tf.</w:t>
+            </w:r>
+          </w:p>
+        </w:tc>
+      </w:tr>
+      <w:tr>
+        <w:tc>
+          <w:tcPr>
+            <w:tcW w:type="dxa" w:w="576"/>
           </w:tcPr>
           <w:p>
             <w:r>
@@ -409,7 +408,42 @@
                 <w:b w:val="0"/>
                 <w:sz w:val="20"/>
               </w:rPr>
-              <w:t>Still in repo git history; rotate in Shopify admin, update Secret Manager, redeploy api.</w:t>
+              <w:t>1.2</w:t>
+            </w:r>
+          </w:p>
+        </w:tc>
+        <w:tc>
+          <w:tcPr>
+            <w:tcW w:type="dxa" w:w="5184"/>
+          </w:tcPr>
+          <w:p>
+            <w:r>
+              <w:rPr>
+                <w:rFonts w:ascii="Calibri" w:hAnsi="Calibri"/>
+                <w:b w:val="0"/>
+                <w:sz w:val="20"/>
+              </w:rPr>
+              <w:t>Audit git history for other secrets (Gemini, Stripe, Firebase admin)</w:t>
+            </w:r>
+          </w:p>
+        </w:tc>
+        <w:tc>
+          <w:tcPr>
+            <w:tcW w:type="dxa" w:w="1296"/>
+          </w:tcPr>
+          <w:p>
+            <w:r>
+              <w:t>DONE</w:t>
+            </w:r>
+          </w:p>
+        </w:tc>
+        <w:tc>
+          <w:tcPr>
+            <w:tcW w:type="dxa" w:w="3600"/>
+          </w:tcPr>
+          <w:p>
+            <w:r>
+              <w:t>Audited full git history (22 commits / 361 blobs) on 2026-06-29. No other committed secrets — Stripe &amp; Gemini keys live only in gitignored api/.secret.local (0 commits) + Secret Manager. The Shopify token was the only secret ever committed.</w:t>
             </w:r>
           </w:p>
         </w:tc>
@@ -426,7 +460,7 @@
                 <w:b w:val="0"/>
                 <w:sz w:val="20"/>
               </w:rPr>
-              <w:t>1.2</w:t>
+              <w:t>1.3</w:t>
             </w:r>
           </w:p>
         </w:tc>
@@ -441,7 +475,7 @@
                 <w:b w:val="0"/>
                 <w:sz w:val="20"/>
               </w:rPr>
-              <w:t>Audit git history for other secrets (Gemini, Stripe, Firebase admin)</w:t>
+              <w:t>Confirm .env, .env.local, service-account JSON keys are in .gitignore</w:t>
             </w:r>
           </w:p>
         </w:tc>
@@ -451,13 +485,7 @@
           </w:tcPr>
           <w:p>
             <w:r>
-              <w:rPr>
-                <w:rFonts w:ascii="Calibri" w:hAnsi="Calibri"/>
-                <w:b/>
-                <w:color w:val="5F6368"/>
-                <w:sz w:val="22"/>
-              </w:rPr>
-              <w:t>TODO</w:t>
+              <w:t>PARTIAL</w:t>
             </w:r>
           </w:p>
         </w:tc>
@@ -467,75 +495,7 @@
           </w:tcPr>
           <w:p>
             <w:r>
-              <w:rPr>
-                <w:rFonts w:ascii="Calibri" w:hAnsi="Calibri"/>
-                <w:b w:val="0"/>
-                <w:sz w:val="20"/>
-              </w:rPr>
-              <w:t>Run git log -p | grep -iE '(api_key|secret|password|token)' across both repos.</w:t>
-            </w:r>
-          </w:p>
-        </w:tc>
-      </w:tr>
-      <w:tr>
-        <w:tc>
-          <w:tcPr>
-            <w:tcW w:type="dxa" w:w="576"/>
-          </w:tcPr>
-          <w:p>
-            <w:r>
-              <w:rPr>
-                <w:rFonts w:ascii="Calibri" w:hAnsi="Calibri"/>
-                <w:b w:val="0"/>
-                <w:sz w:val="20"/>
-              </w:rPr>
-              <w:t>1.3</w:t>
-            </w:r>
-          </w:p>
-        </w:tc>
-        <w:tc>
-          <w:tcPr>
-            <w:tcW w:type="dxa" w:w="5184"/>
-          </w:tcPr>
-          <w:p>
-            <w:r>
-              <w:rPr>
-                <w:rFonts w:ascii="Calibri" w:hAnsi="Calibri"/>
-                <w:b w:val="0"/>
-                <w:sz w:val="20"/>
-              </w:rPr>
-              <w:t>Confirm .env, .env.local, service-account JSON keys are in .gitignore</w:t>
-            </w:r>
-          </w:p>
-        </w:tc>
-        <w:tc>
-          <w:tcPr>
-            <w:tcW w:type="dxa" w:w="1296"/>
-          </w:tcPr>
-          <w:p>
-            <w:r>
-              <w:rPr>
-                <w:rFonts w:ascii="Calibri" w:hAnsi="Calibri"/>
-                <w:b/>
-                <w:color w:val="5F6368"/>
-                <w:sz w:val="22"/>
-              </w:rPr>
-              <w:t>TODO</w:t>
-            </w:r>
-          </w:p>
-        </w:tc>
-        <w:tc>
-          <w:tcPr>
-            <w:tcW w:type="dxa" w:w="3600"/>
-          </w:tcPr>
-          <w:p>
-            <w:r>
-              <w:rPr>
-                <w:rFonts w:ascii="Calibri" w:hAnsi="Calibri"/>
-                <w:b w:val="0"/>
-                <w:sz w:val="20"/>
-              </w:rPr>
-              <w:t>Verify PRHOMZ-AI-DESIGNER and PRHOMZ-AI-LANDING.</w:t>
+              <w:t>DESIGNER repo confirmed: api/.secret.local is gitignored and 0 commits touch it. Still verify PRHOMZ-AI-LANDING repo.</w:t>
             </w:r>
           </w:p>
         </w:tc>
@@ -1357,23 +1317,7 @@
     </w:p>
     <w:p>
       <w:r>
-        <w:rPr>
-          <w:rFonts w:ascii="Calibri" w:hAnsi="Calibri"/>
-          <w:b/>
-          <w:color w:val="103366"/>
-          <w:sz w:val="28"/>
-        </w:rPr>
-        <w:t>3. Stripe Live Mode</w:t>
-        <w:t xml:space="preserve">  </w:t>
-      </w:r>
-      <w:r>
-        <w:rPr>
-          <w:rFonts w:ascii="Calibri" w:hAnsi="Calibri"/>
-          <w:b/>
-          <w:color w:val="C5221F"/>
-          <w:sz w:val="22"/>
-        </w:rPr>
-        <w:t>[BLOCKER]</w:t>
+        <w:t>3. Stripe Live Mode  [BLOCKER — DONE except live test]</w:t>
       </w:r>
     </w:p>
     <w:tbl>
@@ -1492,19 +1436,25 @@
           </w:tcPr>
           <w:p>
             <w:r>
-              <w:rPr>
-                <w:rFonts w:ascii="Calibri" w:hAnsi="Calibri"/>
-                <w:b/>
-                <w:color w:val="5F6368"/>
-                <w:sz w:val="22"/>
-              </w:rPr>
-              <w:t>TODO</w:t>
+              <w:t>DONE</w:t>
             </w:r>
           </w:p>
         </w:tc>
         <w:tc>
           <w:tcPr>
             <w:tcW w:type="dxa" w:w="3600"/>
+          </w:tcPr>
+          <w:p>
+            <w:r>
+              <w:t>Brand-new dedicated Stripe business account (PRHOMZ INC) via stakeholder; live mode active.</w:t>
+            </w:r>
+          </w:p>
+        </w:tc>
+      </w:tr>
+      <w:tr>
+        <w:tc>
+          <w:tcPr>
+            <w:tcW w:type="dxa" w:w="576"/>
           </w:tcPr>
           <w:p>
             <w:r>
@@ -1513,7 +1463,42 @@
                 <w:b w:val="0"/>
                 <w:sz w:val="20"/>
               </w:rPr>
-              <w:t>Required before activating live mode.</w:t>
+              <w:t>3.2</w:t>
+            </w:r>
+          </w:p>
+        </w:tc>
+        <w:tc>
+          <w:tcPr>
+            <w:tcW w:type="dxa" w:w="5184"/>
+          </w:tcPr>
+          <w:p>
+            <w:r>
+              <w:rPr>
+                <w:rFonts w:ascii="Calibri" w:hAnsi="Calibri"/>
+                <w:b w:val="0"/>
+                <w:sz w:val="20"/>
+              </w:rPr>
+              <w:t>Create live-mode products + prices for Basic/Advanced/Designer tiers, mirroring test mode</w:t>
+            </w:r>
+          </w:p>
+        </w:tc>
+        <w:tc>
+          <w:tcPr>
+            <w:tcW w:type="dxa" w:w="1296"/>
+          </w:tcPr>
+          <w:p>
+            <w:r>
+              <w:t>DONE</w:t>
+            </w:r>
+          </w:p>
+        </w:tc>
+        <w:tc>
+          <w:tcPr>
+            <w:tcW w:type="dxa" w:w="3600"/>
+          </w:tcPr>
+          <w:p>
+            <w:r>
+              <w:t>Live products+prices created 2026-06-29: Basic $9.99 / Advanced $19.99 / Designer $49.99 (recurring monthly).</w:t>
             </w:r>
           </w:p>
         </w:tc>
@@ -1530,7 +1515,7 @@
                 <w:b w:val="0"/>
                 <w:sz w:val="20"/>
               </w:rPr>
-              <w:t>3.2</w:t>
+              <w:t>3.3</w:t>
             </w:r>
           </w:p>
         </w:tc>
@@ -1545,7 +1530,7 @@
                 <w:b w:val="0"/>
                 <w:sz w:val="20"/>
               </w:rPr>
-              <w:t>Create live-mode products + prices for Basic/Advanced/Designer tiers, mirroring test mode</w:t>
+              <w:t>Update shared/pricing.ts with live price IDs (or env-var swap)</w:t>
             </w:r>
           </w:p>
         </w:tc>
@@ -1555,19 +1540,25 @@
           </w:tcPr>
           <w:p>
             <w:r>
-              <w:rPr>
-                <w:rFonts w:ascii="Calibri" w:hAnsi="Calibri"/>
-                <w:b/>
-                <w:color w:val="5F6368"/>
-                <w:sz w:val="22"/>
-              </w:rPr>
-              <w:t>TODO</w:t>
+              <w:t>DONE</w:t>
             </w:r>
           </w:p>
         </w:tc>
         <w:tc>
           <w:tcPr>
             <w:tcW w:type="dxa" w:w="3600"/>
+          </w:tcPr>
+          <w:p>
+            <w:r>
+              <w:t>shared/pricing.ts updated with live price IDs (commit a5458f0); production-only, no test fallback.</w:t>
+            </w:r>
+          </w:p>
+        </w:tc>
+      </w:tr>
+      <w:tr>
+        <w:tc>
+          <w:tcPr>
+            <w:tcW w:type="dxa" w:w="576"/>
           </w:tcPr>
           <w:p>
             <w:r>
@@ -1576,7 +1567,42 @@
                 <w:b w:val="0"/>
                 <w:sz w:val="20"/>
               </w:rPr>
-              <w:t>Note live price IDs.</w:t>
+              <w:t>3.4</w:t>
+            </w:r>
+          </w:p>
+        </w:tc>
+        <w:tc>
+          <w:tcPr>
+            <w:tcW w:type="dxa" w:w="5184"/>
+          </w:tcPr>
+          <w:p>
+            <w:r>
+              <w:rPr>
+                <w:rFonts w:ascii="Calibri" w:hAnsi="Calibri"/>
+                <w:b w:val="0"/>
+                <w:sz w:val="20"/>
+              </w:rPr>
+              <w:t>Generate live mode Stripe secret key, store in Secret Manager as new version of stripe-secret-key</w:t>
+            </w:r>
+          </w:p>
+        </w:tc>
+        <w:tc>
+          <w:tcPr>
+            <w:tcW w:type="dxa" w:w="1296"/>
+          </w:tcPr>
+          <w:p>
+            <w:r>
+              <w:t>DONE</w:t>
+            </w:r>
+          </w:p>
+        </w:tc>
+        <w:tc>
+          <w:tcPr>
+            <w:tcW w:type="dxa" w:w="3600"/>
+          </w:tcPr>
+          <w:p>
+            <w:r>
+              <w:t>sk_live stored as stripe-secret-key v2 in Secret Manager; api + stripe-webhook redeployed (image v8, key:latest).</w:t>
             </w:r>
           </w:p>
         </w:tc>
@@ -1593,7 +1619,7 @@
                 <w:b w:val="0"/>
                 <w:sz w:val="20"/>
               </w:rPr>
-              <w:t>3.3</w:t>
+              <w:t>3.5</w:t>
             </w:r>
           </w:p>
         </w:tc>
@@ -1608,7 +1634,7 @@
                 <w:b w:val="0"/>
                 <w:sz w:val="20"/>
               </w:rPr>
-              <w:t>Update shared/pricing.ts with live price IDs (or env-var swap)</w:t>
+              <w:t>Create live mode webhook endpoint pointing at stripe-webhook service. Store signing secret as new version of stripe-webhook-secret</w:t>
             </w:r>
           </w:p>
         </w:tc>
@@ -1618,19 +1644,25 @@
           </w:tcPr>
           <w:p>
             <w:r>
-              <w:rPr>
-                <w:rFonts w:ascii="Calibri" w:hAnsi="Calibri"/>
-                <w:b/>
-                <w:color w:val="5F6368"/>
-                <w:sz w:val="22"/>
-              </w:rPr>
-              <w:t>TODO</w:t>
+              <w:t>DONE</w:t>
             </w:r>
           </w:p>
         </w:tc>
         <w:tc>
           <w:tcPr>
             <w:tcW w:type="dxa" w:w="3600"/>
+          </w:tcPr>
+          <w:p>
+            <w:r>
+              <w:t>Live endpoint https://stripe-webhook-lm4jlrh5qq-uc.a.run.app/webhook subscribed to customer.subscription.created/updated/deleted + invoice.payment_failed; signing secret stored as stripe-webhook-secret v3. Signature verification confirmed (unsigned POST -&gt; 400).</w:t>
+            </w:r>
+          </w:p>
+        </w:tc>
+      </w:tr>
+      <w:tr>
+        <w:tc>
+          <w:tcPr>
+            <w:tcW w:type="dxa" w:w="576"/>
           </w:tcPr>
           <w:p>
             <w:r>
@@ -1639,7 +1671,42 @@
                 <w:b w:val="0"/>
                 <w:sz w:val="20"/>
               </w:rPr>
-              <w:t>Decide: hardcode live IDs or use STRIPE_PRICE_IDS_LIVE env var.</w:t>
+              <w:t>3.6</w:t>
+            </w:r>
+          </w:p>
+        </w:tc>
+        <w:tc>
+          <w:tcPr>
+            <w:tcW w:type="dxa" w:w="5184"/>
+          </w:tcPr>
+          <w:p>
+            <w:r>
+              <w:rPr>
+                <w:rFonts w:ascii="Calibri" w:hAnsi="Calibri"/>
+                <w:b w:val="0"/>
+                <w:sz w:val="20"/>
+              </w:rPr>
+              <w:t>Configure Customer Portal in Stripe (live mode)</w:t>
+            </w:r>
+          </w:p>
+        </w:tc>
+        <w:tc>
+          <w:tcPr>
+            <w:tcW w:type="dxa" w:w="1296"/>
+          </w:tcPr>
+          <w:p>
+            <w:r>
+              <w:t>PARTIAL</w:t>
+            </w:r>
+          </w:p>
+        </w:tc>
+        <w:tc>
+          <w:tcPr>
+            <w:tcW w:type="dxa" w:w="3600"/>
+          </w:tcPr>
+          <w:p>
+            <w:r>
+              <w:t>Activated during setup; confirm live-mode branding, allowed plan switches, and cancellation flow.</w:t>
             </w:r>
           </w:p>
         </w:tc>
@@ -1656,7 +1723,7 @@
                 <w:b w:val="0"/>
                 <w:sz w:val="20"/>
               </w:rPr>
-              <w:t>3.4</w:t>
+              <w:t>3.7</w:t>
             </w:r>
           </w:p>
         </w:tc>
@@ -1671,7 +1738,7 @@
                 <w:b w:val="0"/>
                 <w:sz w:val="20"/>
               </w:rPr>
-              <w:t>Generate live mode Stripe secret key, store in Secret Manager as new version of stripe-secret-key</w:t>
+              <w:t>End-to-end test in live mode with a real card (small amount, refund immediately)</w:t>
             </w:r>
           </w:p>
         </w:tc>
@@ -1681,12 +1748,6 @@
           </w:tcPr>
           <w:p>
             <w:r>
-              <w:rPr>
-                <w:rFonts w:ascii="Calibri" w:hAnsi="Calibri"/>
-                <w:b/>
-                <w:color w:val="5F6368"/>
-                <w:sz w:val="22"/>
-              </w:rPr>
               <w:t>TODO</w:t>
             </w:r>
           </w:p>
@@ -1697,201 +1758,7 @@
           </w:tcPr>
           <w:p>
             <w:r>
-              <w:rPr>
-                <w:rFonts w:ascii="Calibri" w:hAnsi="Calibri"/>
-                <w:b w:val="0"/>
-                <w:sz w:val="20"/>
-              </w:rPr>
-              <w:t>Keep test key alongside (versioned).</w:t>
-            </w:r>
-          </w:p>
-        </w:tc>
-      </w:tr>
-      <w:tr>
-        <w:tc>
-          <w:tcPr>
-            <w:tcW w:type="dxa" w:w="576"/>
-          </w:tcPr>
-          <w:p>
-            <w:r>
-              <w:rPr>
-                <w:rFonts w:ascii="Calibri" w:hAnsi="Calibri"/>
-                <w:b w:val="0"/>
-                <w:sz w:val="20"/>
-              </w:rPr>
-              <w:t>3.5</w:t>
-            </w:r>
-          </w:p>
-        </w:tc>
-        <w:tc>
-          <w:tcPr>
-            <w:tcW w:type="dxa" w:w="5184"/>
-          </w:tcPr>
-          <w:p>
-            <w:r>
-              <w:rPr>
-                <w:rFonts w:ascii="Calibri" w:hAnsi="Calibri"/>
-                <w:b w:val="0"/>
-                <w:sz w:val="20"/>
-              </w:rPr>
-              <w:t>Create live mode webhook endpoint pointing at stripe-webhook service. Store signing secret as new version of stripe-webhook-secret</w:t>
-            </w:r>
-          </w:p>
-        </w:tc>
-        <w:tc>
-          <w:tcPr>
-            <w:tcW w:type="dxa" w:w="1296"/>
-          </w:tcPr>
-          <w:p>
-            <w:r>
-              <w:rPr>
-                <w:rFonts w:ascii="Calibri" w:hAnsi="Calibri"/>
-                <w:b/>
-                <w:color w:val="5F6368"/>
-                <w:sz w:val="22"/>
-              </w:rPr>
-              <w:t>TODO</w:t>
-            </w:r>
-          </w:p>
-        </w:tc>
-        <w:tc>
-          <w:tcPr>
-            <w:tcW w:type="dxa" w:w="3600"/>
-          </w:tcPr>
-          <w:p>
-            <w:r>
-              <w:rPr>
-                <w:rFonts w:ascii="Calibri" w:hAnsi="Calibri"/>
-                <w:b w:val="0"/>
-                <w:sz w:val="20"/>
-              </w:rPr>
-              <w:t>Subscribe to: customer.subscription.created/updated/deleted, invoice.paid, checkout.session.completed.</w:t>
-            </w:r>
-          </w:p>
-        </w:tc>
-      </w:tr>
-      <w:tr>
-        <w:tc>
-          <w:tcPr>
-            <w:tcW w:type="dxa" w:w="576"/>
-          </w:tcPr>
-          <w:p>
-            <w:r>
-              <w:rPr>
-                <w:rFonts w:ascii="Calibri" w:hAnsi="Calibri"/>
-                <w:b w:val="0"/>
-                <w:sz w:val="20"/>
-              </w:rPr>
-              <w:t>3.6</w:t>
-            </w:r>
-          </w:p>
-        </w:tc>
-        <w:tc>
-          <w:tcPr>
-            <w:tcW w:type="dxa" w:w="5184"/>
-          </w:tcPr>
-          <w:p>
-            <w:r>
-              <w:rPr>
-                <w:rFonts w:ascii="Calibri" w:hAnsi="Calibri"/>
-                <w:b w:val="0"/>
-                <w:sz w:val="20"/>
-              </w:rPr>
-              <w:t>Configure Customer Portal in Stripe (live mode)</w:t>
-            </w:r>
-          </w:p>
-        </w:tc>
-        <w:tc>
-          <w:tcPr>
-            <w:tcW w:type="dxa" w:w="1296"/>
-          </w:tcPr>
-          <w:p>
-            <w:r>
-              <w:rPr>
-                <w:rFonts w:ascii="Calibri" w:hAnsi="Calibri"/>
-                <w:b/>
-                <w:color w:val="5F6368"/>
-                <w:sz w:val="22"/>
-              </w:rPr>
-              <w:t>TODO</w:t>
-            </w:r>
-          </w:p>
-        </w:tc>
-        <w:tc>
-          <w:tcPr>
-            <w:tcW w:type="dxa" w:w="3600"/>
-          </w:tcPr>
-          <w:p>
-            <w:r>
-              <w:rPr>
-                <w:rFonts w:ascii="Calibri" w:hAnsi="Calibri"/>
-                <w:b w:val="0"/>
-                <w:sz w:val="20"/>
-              </w:rPr>
-              <w:t>Branding, cancellation flow, allowed updates.</w:t>
-            </w:r>
-          </w:p>
-        </w:tc>
-      </w:tr>
-      <w:tr>
-        <w:tc>
-          <w:tcPr>
-            <w:tcW w:type="dxa" w:w="576"/>
-          </w:tcPr>
-          <w:p>
-            <w:r>
-              <w:rPr>
-                <w:rFonts w:ascii="Calibri" w:hAnsi="Calibri"/>
-                <w:b w:val="0"/>
-                <w:sz w:val="20"/>
-              </w:rPr>
-              <w:t>3.7</w:t>
-            </w:r>
-          </w:p>
-        </w:tc>
-        <w:tc>
-          <w:tcPr>
-            <w:tcW w:type="dxa" w:w="5184"/>
-          </w:tcPr>
-          <w:p>
-            <w:r>
-              <w:rPr>
-                <w:rFonts w:ascii="Calibri" w:hAnsi="Calibri"/>
-                <w:b w:val="0"/>
-                <w:sz w:val="20"/>
-              </w:rPr>
-              <w:t>End-to-end test in live mode with a real card (small amount, refund immediately)</w:t>
-            </w:r>
-          </w:p>
-        </w:tc>
-        <w:tc>
-          <w:tcPr>
-            <w:tcW w:type="dxa" w:w="1296"/>
-          </w:tcPr>
-          <w:p>
-            <w:r>
-              <w:rPr>
-                <w:rFonts w:ascii="Calibri" w:hAnsi="Calibri"/>
-                <w:b/>
-                <w:color w:val="5F6368"/>
-                <w:sz w:val="22"/>
-              </w:rPr>
-              <w:t>TODO</w:t>
-            </w:r>
-          </w:p>
-        </w:tc>
-        <w:tc>
-          <w:tcPr>
-            <w:tcW w:type="dxa" w:w="3600"/>
-          </w:tcPr>
-          <w:p>
-            <w:r>
-              <w:rPr>
-                <w:rFonts w:ascii="Calibri" w:hAnsi="Calibri"/>
-                <w:b w:val="0"/>
-                <w:sz w:val="20"/>
-              </w:rPr>
-              <w:t>Critical regression test before announcing.</w:t>
+              <w:t>Delegated to stakeholder: real $9.99 on Basic -&gt; tier update -&gt; portal cancel -&gt; refund. Use a FRESH verified-email signup; test-phase users carry stale test customer IDs (cus_...) that error against the live account.</w:t>
             </w:r>
           </w:p>
         </w:tc>

</xml_diff>

<commit_message>
docs: mark §2 app-domain items done (designer.prhomzai.com live)
App subdomain designer.prhomzai.com now live on Firebase Hosting with
minted cert, added to Auth authorized domains, and branding the
verification email link. Marked checklist items 2.1, 2.3, 2.5, 2.7 done.

Co-Authored-By: Claude Opus 4.8 <noreply@anthropic.com>
</commit_message>
<xml_diff>
--- a/PRODUCTION_LAUNCH_CHECKLIST.docx
+++ b/PRODUCTION_LAUNCH_CHECKLIST.docx
@@ -900,6 +900,58 @@
           </w:tcPr>
           <w:p>
             <w:r>
+              <w:t>DONE</w:t>
+            </w:r>
+          </w:p>
+        </w:tc>
+        <w:tc>
+          <w:tcPr>
+            <w:tcW w:type="dxa" w:w="3600"/>
+          </w:tcPr>
+          <w:p>
+            <w:r>
+              <w:t>Stakeholder registered prhomzai.com on GoDaddy; Niraj has Delegate Access.</w:t>
+            </w:r>
+          </w:p>
+        </w:tc>
+      </w:tr>
+      <w:tr>
+        <w:tc>
+          <w:tcPr>
+            <w:tcW w:type="dxa" w:w="576"/>
+          </w:tcPr>
+          <w:p>
+            <w:r>
+              <w:rPr>
+                <w:rFonts w:ascii="Calibri" w:hAnsi="Calibri"/>
+                <w:b w:val="0"/>
+                <w:sz w:val="20"/>
+              </w:rPr>
+              <w:t>2.2</w:t>
+            </w:r>
+          </w:p>
+        </w:tc>
+        <w:tc>
+          <w:tcPr>
+            <w:tcW w:type="dxa" w:w="5184"/>
+          </w:tcPr>
+          <w:p>
+            <w:r>
+              <w:rPr>
+                <w:rFonts w:ascii="Calibri" w:hAnsi="Calibri"/>
+                <w:b w:val="0"/>
+                <w:sz w:val="20"/>
+              </w:rPr>
+              <w:t>Cloud Run domain mapping: prhomzai.com + www.prhomzai.com -&gt; landing service</w:t>
+            </w:r>
+          </w:p>
+        </w:tc>
+        <w:tc>
+          <w:tcPr>
+            <w:tcW w:type="dxa" w:w="1296"/>
+          </w:tcPr>
+          <w:p>
+            <w:r>
               <w:rPr>
                 <w:rFonts w:ascii="Calibri" w:hAnsi="Calibri"/>
                 <w:b/>
@@ -921,7 +973,7 @@
                 <w:b w:val="0"/>
                 <w:sz w:val="20"/>
               </w:rPr>
-              <w:t>Recommended registrar: Google Domains / Squarespace / Cloudflare.</w:t>
+              <w:t>gcloud beta run domain-mappings create</w:t>
             </w:r>
           </w:p>
         </w:tc>
@@ -938,7 +990,7 @@
                 <w:b w:val="0"/>
                 <w:sz w:val="20"/>
               </w:rPr>
-              <w:t>2.2</w:t>
+              <w:t>2.3</w:t>
             </w:r>
           </w:p>
         </w:tc>
@@ -953,7 +1005,59 @@
                 <w:b w:val="0"/>
                 <w:sz w:val="20"/>
               </w:rPr>
-              <w:t>Cloud Run domain mapping: prhomzai.com + www.prhomzai.com -&gt; landing service</w:t>
+              <w:t>Firebase Hosting custom domain: designer.prhomzai.com -&gt; app site</w:t>
+            </w:r>
+          </w:p>
+        </w:tc>
+        <w:tc>
+          <w:tcPr>
+            <w:tcW w:type="dxa" w:w="1296"/>
+          </w:tcPr>
+          <w:p>
+            <w:r>
+              <w:t>DONE</w:t>
+            </w:r>
+          </w:p>
+        </w:tc>
+        <w:tc>
+          <w:tcPr>
+            <w:tcW w:type="dxa" w:w="3600"/>
+          </w:tcPr>
+          <w:p>
+            <w:r>
+              <w:t>designer.prhomzai.com connected to Firebase Hosting (CNAME -&gt; prhomzmvp-nonprod.web.app), verified + cert minted 2026-07-15. App live at https://designer.prhomzai.com.</w:t>
+            </w:r>
+          </w:p>
+        </w:tc>
+      </w:tr>
+      <w:tr>
+        <w:tc>
+          <w:tcPr>
+            <w:tcW w:type="dxa" w:w="576"/>
+          </w:tcPr>
+          <w:p>
+            <w:r>
+              <w:rPr>
+                <w:rFonts w:ascii="Calibri" w:hAnsi="Calibri"/>
+                <w:b w:val="0"/>
+                <w:sz w:val="20"/>
+              </w:rPr>
+              <w:t>2.4</w:t>
+            </w:r>
+          </w:p>
+        </w:tc>
+        <w:tc>
+          <w:tcPr>
+            <w:tcW w:type="dxa" w:w="5184"/>
+          </w:tcPr>
+          <w:p>
+            <w:r>
+              <w:rPr>
+                <w:rFonts w:ascii="Calibri" w:hAnsi="Calibri"/>
+                <w:b w:val="0"/>
+                <w:sz w:val="20"/>
+              </w:rPr>
+              <w:t>Update PRHOMZ-AI-LANDING/src/components/PricingSubscription.tsx:116 Designer link to https://designer.prhomzai.com/</w:t>
             </w:r>
           </w:p>
         </w:tc>
@@ -984,7 +1088,7 @@
                 <w:b w:val="0"/>
                 <w:sz w:val="20"/>
               </w:rPr>
-              <w:t>gcloud beta run domain-mappings create</w:t>
+              <w:t>One-line change. Redeploy as v3.</w:t>
             </w:r>
           </w:p>
         </w:tc>
@@ -1001,7 +1105,7 @@
                 <w:b w:val="0"/>
                 <w:sz w:val="20"/>
               </w:rPr>
-              <w:t>2.3</w:t>
+              <w:t>2.5</w:t>
             </w:r>
           </w:p>
         </w:tc>
@@ -1016,7 +1120,59 @@
                 <w:b w:val="0"/>
                 <w:sz w:val="20"/>
               </w:rPr>
-              <w:t>Firebase Hosting custom domain: designer.prhomzai.com -&gt; app site</w:t>
+              <w:t>Verify HTTPS certificate auto-provisioning for both domains</w:t>
+            </w:r>
+          </w:p>
+        </w:tc>
+        <w:tc>
+          <w:tcPr>
+            <w:tcW w:type="dxa" w:w="1296"/>
+          </w:tcPr>
+          <w:p>
+            <w:r>
+              <w:t>DONE</w:t>
+            </w:r>
+          </w:p>
+        </w:tc>
+        <w:tc>
+          <w:tcPr>
+            <w:tcW w:type="dxa" w:w="3600"/>
+          </w:tcPr>
+          <w:p>
+            <w:r>
+              <w:t>HTTPS cert auto-provisioned for designer.prhomzai.com (verified serving).</w:t>
+            </w:r>
+          </w:p>
+        </w:tc>
+      </w:tr>
+      <w:tr>
+        <w:tc>
+          <w:tcPr>
+            <w:tcW w:type="dxa" w:w="576"/>
+          </w:tcPr>
+          <w:p>
+            <w:r>
+              <w:rPr>
+                <w:rFonts w:ascii="Calibri" w:hAnsi="Calibri"/>
+                <w:b w:val="0"/>
+                <w:sz w:val="20"/>
+              </w:rPr>
+              <w:t>2.6</w:t>
+            </w:r>
+          </w:p>
+        </w:tc>
+        <w:tc>
+          <w:tcPr>
+            <w:tcW w:type="dxa" w:w="5184"/>
+          </w:tcPr>
+          <w:p>
+            <w:r>
+              <w:rPr>
+                <w:rFonts w:ascii="Calibri" w:hAnsi="Calibri"/>
+                <w:b w:val="0"/>
+                <w:sz w:val="20"/>
+              </w:rPr>
+              <w:t>Test prhomzai.com -&gt; www.prhomzai.com redirect (or vice versa)</w:t>
             </w:r>
           </w:p>
         </w:tc>
@@ -1047,7 +1203,7 @@
                 <w:b w:val="0"/>
                 <w:sz w:val="20"/>
               </w:rPr>
-              <w:t>Firebase console -&gt; Hosting -&gt; Add custom domain.</w:t>
+              <w:t>Decide canonical host.</w:t>
             </w:r>
           </w:p>
         </w:tc>
@@ -1064,7 +1220,7 @@
                 <w:b w:val="0"/>
                 <w:sz w:val="20"/>
               </w:rPr>
-              <w:t>2.4</w:t>
+              <w:t>2.7</w:t>
             </w:r>
           </w:p>
         </w:tc>
@@ -1079,7 +1235,7 @@
                 <w:b w:val="0"/>
                 <w:sz w:val="20"/>
               </w:rPr>
-              <w:t>Update PRHOMZ-AI-LANDING/src/components/PricingSubscription.tsx:116 Designer link to https://designer.prhomzai.com/</w:t>
+              <w:t>Add domain to Firebase Auth authorized domains</w:t>
             </w:r>
           </w:p>
         </w:tc>
@@ -1089,13 +1245,7 @@
           </w:tcPr>
           <w:p>
             <w:r>
-              <w:rPr>
-                <w:rFonts w:ascii="Calibri" w:hAnsi="Calibri"/>
-                <w:b/>
-                <w:color w:val="5F6368"/>
-                <w:sz w:val="22"/>
-              </w:rPr>
-              <w:t>TODO</w:t>
+              <w:t>DONE</w:t>
             </w:r>
           </w:p>
         </w:tc>
@@ -1105,201 +1255,7 @@
           </w:tcPr>
           <w:p>
             <w:r>
-              <w:rPr>
-                <w:rFonts w:ascii="Calibri" w:hAnsi="Calibri"/>
-                <w:b w:val="0"/>
-                <w:sz w:val="20"/>
-              </w:rPr>
-              <w:t>One-line change. Redeploy as v3.</w:t>
-            </w:r>
-          </w:p>
-        </w:tc>
-      </w:tr>
-      <w:tr>
-        <w:tc>
-          <w:tcPr>
-            <w:tcW w:type="dxa" w:w="576"/>
-          </w:tcPr>
-          <w:p>
-            <w:r>
-              <w:rPr>
-                <w:rFonts w:ascii="Calibri" w:hAnsi="Calibri"/>
-                <w:b w:val="0"/>
-                <w:sz w:val="20"/>
-              </w:rPr>
-              <w:t>2.5</w:t>
-            </w:r>
-          </w:p>
-        </w:tc>
-        <w:tc>
-          <w:tcPr>
-            <w:tcW w:type="dxa" w:w="5184"/>
-          </w:tcPr>
-          <w:p>
-            <w:r>
-              <w:rPr>
-                <w:rFonts w:ascii="Calibri" w:hAnsi="Calibri"/>
-                <w:b w:val="0"/>
-                <w:sz w:val="20"/>
-              </w:rPr>
-              <w:t>Verify HTTPS certificate auto-provisioning for both domains</w:t>
-            </w:r>
-          </w:p>
-        </w:tc>
-        <w:tc>
-          <w:tcPr>
-            <w:tcW w:type="dxa" w:w="1296"/>
-          </w:tcPr>
-          <w:p>
-            <w:r>
-              <w:rPr>
-                <w:rFonts w:ascii="Calibri" w:hAnsi="Calibri"/>
-                <w:b/>
-                <w:color w:val="5F6368"/>
-                <w:sz w:val="22"/>
-              </w:rPr>
-              <w:t>TODO</w:t>
-            </w:r>
-          </w:p>
-        </w:tc>
-        <w:tc>
-          <w:tcPr>
-            <w:tcW w:type="dxa" w:w="3600"/>
-          </w:tcPr>
-          <w:p>
-            <w:r>
-              <w:rPr>
-                <w:rFonts w:ascii="Calibri" w:hAnsi="Calibri"/>
-                <w:b w:val="0"/>
-                <w:sz w:val="20"/>
-              </w:rPr>
-              <w:t>Wait 15-60 min after DNS propagates.</w:t>
-            </w:r>
-          </w:p>
-        </w:tc>
-      </w:tr>
-      <w:tr>
-        <w:tc>
-          <w:tcPr>
-            <w:tcW w:type="dxa" w:w="576"/>
-          </w:tcPr>
-          <w:p>
-            <w:r>
-              <w:rPr>
-                <w:rFonts w:ascii="Calibri" w:hAnsi="Calibri"/>
-                <w:b w:val="0"/>
-                <w:sz w:val="20"/>
-              </w:rPr>
-              <w:t>2.6</w:t>
-            </w:r>
-          </w:p>
-        </w:tc>
-        <w:tc>
-          <w:tcPr>
-            <w:tcW w:type="dxa" w:w="5184"/>
-          </w:tcPr>
-          <w:p>
-            <w:r>
-              <w:rPr>
-                <w:rFonts w:ascii="Calibri" w:hAnsi="Calibri"/>
-                <w:b w:val="0"/>
-                <w:sz w:val="20"/>
-              </w:rPr>
-              <w:t>Test prhomzai.com -&gt; www.prhomzai.com redirect (or vice versa)</w:t>
-            </w:r>
-          </w:p>
-        </w:tc>
-        <w:tc>
-          <w:tcPr>
-            <w:tcW w:type="dxa" w:w="1296"/>
-          </w:tcPr>
-          <w:p>
-            <w:r>
-              <w:rPr>
-                <w:rFonts w:ascii="Calibri" w:hAnsi="Calibri"/>
-                <w:b/>
-                <w:color w:val="5F6368"/>
-                <w:sz w:val="22"/>
-              </w:rPr>
-              <w:t>TODO</w:t>
-            </w:r>
-          </w:p>
-        </w:tc>
-        <w:tc>
-          <w:tcPr>
-            <w:tcW w:type="dxa" w:w="3600"/>
-          </w:tcPr>
-          <w:p>
-            <w:r>
-              <w:rPr>
-                <w:rFonts w:ascii="Calibri" w:hAnsi="Calibri"/>
-                <w:b w:val="0"/>
-                <w:sz w:val="20"/>
-              </w:rPr>
-              <w:t>Decide canonical host.</w:t>
-            </w:r>
-          </w:p>
-        </w:tc>
-      </w:tr>
-      <w:tr>
-        <w:tc>
-          <w:tcPr>
-            <w:tcW w:type="dxa" w:w="576"/>
-          </w:tcPr>
-          <w:p>
-            <w:r>
-              <w:rPr>
-                <w:rFonts w:ascii="Calibri" w:hAnsi="Calibri"/>
-                <w:b w:val="0"/>
-                <w:sz w:val="20"/>
-              </w:rPr>
-              <w:t>2.7</w:t>
-            </w:r>
-          </w:p>
-        </w:tc>
-        <w:tc>
-          <w:tcPr>
-            <w:tcW w:type="dxa" w:w="5184"/>
-          </w:tcPr>
-          <w:p>
-            <w:r>
-              <w:rPr>
-                <w:rFonts w:ascii="Calibri" w:hAnsi="Calibri"/>
-                <w:b w:val="0"/>
-                <w:sz w:val="20"/>
-              </w:rPr>
-              <w:t>Add domain to Firebase Auth authorized domains</w:t>
-            </w:r>
-          </w:p>
-        </w:tc>
-        <w:tc>
-          <w:tcPr>
-            <w:tcW w:type="dxa" w:w="1296"/>
-          </w:tcPr>
-          <w:p>
-            <w:r>
-              <w:rPr>
-                <w:rFonts w:ascii="Calibri" w:hAnsi="Calibri"/>
-                <w:b/>
-                <w:color w:val="5F6368"/>
-                <w:sz w:val="22"/>
-              </w:rPr>
-              <w:t>TODO</w:t>
-            </w:r>
-          </w:p>
-        </w:tc>
-        <w:tc>
-          <w:tcPr>
-            <w:tcW w:type="dxa" w:w="3600"/>
-          </w:tcPr>
-          <w:p>
-            <w:r>
-              <w:rPr>
-                <w:rFonts w:ascii="Calibri" w:hAnsi="Calibri"/>
-                <w:b w:val="0"/>
-                <w:sz w:val="20"/>
-              </w:rPr>
-              <w:t>designer.prhomzai.com for email-link auth + verification emails.</w:t>
+              <w:t>designer.prhomzai.com added to Firebase Auth Authorized domains; VITE_FIREBASE_AUTH_DOMAIN switched to it so verification links are branded.</w:t>
             </w:r>
           </w:p>
         </w:tc>

</xml_diff>

<commit_message>
docs+privacy: IP region-detection notice; checklist Stripe test done + geo DB rebuild
- Privacy Policy (TermsModal): disclose signup profile fields collected and
  IP-based approximate-location processing for region features (Shop the Look).
- Checklist: mark 3.7 (live real-money test) DONE per stakeholder; section 3
  now [DONE]; 12.3 (live upgrade -> tier) DONE; add 6.10 monthly GeoLite2 DB
  rebuild.

Co-Authored-By: Claude Opus 4.8 <noreply@anthropic.com>
</commit_message>
<xml_diff>
--- a/PRODUCTION_LAUNCH_CHECKLIST.docx
+++ b/PRODUCTION_LAUNCH_CHECKLIST.docx
@@ -1273,7 +1273,7 @@
     </w:p>
     <w:p>
       <w:r>
-        <w:t>3. Stripe Live Mode  [BLOCKER — DONE except live test]</w:t>
+        <w:t>3. Stripe Live Mode  [DONE]</w:t>
       </w:r>
     </w:p>
     <w:tbl>
@@ -1704,7 +1704,7 @@
           </w:tcPr>
           <w:p>
             <w:r>
-              <w:t>TODO</w:t>
+              <w:t>DONE</w:t>
             </w:r>
           </w:p>
         </w:tc>
@@ -1714,7 +1714,7 @@
           </w:tcPr>
           <w:p>
             <w:r>
-              <w:t>Delegated to stakeholder: real $9.99 on Basic -&gt; tier update -&gt; portal cancel -&gt; refund. Use a FRESH verified-email signup; test-phase users carry stale test customer IDs (cus_...) that error against the live account.</w:t>
+              <w:t>Stakeholder completed the live real-money test successfully (real card on Basic $9.99 -&gt; tier updated; refunded). Confirmed 2026-07-16.</w:t>
             </w:r>
           </w:p>
         </w:tc>
@@ -3498,6 +3498,48 @@
           </w:p>
         </w:tc>
       </w:tr>
+      <w:tr>
+        <w:tc>
+          <w:tcPr>
+            <w:tcW w:type="dxa" w:w="2520"/>
+          </w:tcPr>
+          <w:p>
+            <w:r>
+              <w:t>6.10</w:t>
+            </w:r>
+          </w:p>
+        </w:tc>
+        <w:tc>
+          <w:tcPr>
+            <w:tcW w:type="dxa" w:w="2520"/>
+          </w:tcPr>
+          <w:p>
+            <w:r>
+              <w:t>Monthly rebuild of the api image to refresh the bundled MaxMind GeoLite2-Country DB (Shop the Look US geofencing)</w:t>
+            </w:r>
+          </w:p>
+        </w:tc>
+        <w:tc>
+          <w:tcPr>
+            <w:tcW w:type="dxa" w:w="2520"/>
+          </w:tcPr>
+          <w:p>
+            <w:r>
+              <w:t>TODO</w:t>
+            </w:r>
+          </w:p>
+        </w:tc>
+        <w:tc>
+          <w:tcPr>
+            <w:tcW w:type="dxa" w:w="2520"/>
+          </w:tcPr>
+          <w:p>
+            <w:r>
+              <w:t>DB is baked in at build time (cloudbuild.yaml downloads from maxmind-license-key secret). Country data drifts slowly, so monthly is ample. Automate via Cloud Scheduler-triggered rebuild or a monthly manual 'gcloud builds submit'.</w:t>
+            </w:r>
+          </w:p>
+        </w:tc>
+      </w:tr>
     </w:tbl>
     <w:p>
       <w:r>
@@ -6470,7 +6512,7 @@
                 <w:color w:val="5F6368"/>
                 <w:sz w:val="22"/>
               </w:rPr>
-              <w:t>TODO</w:t>
+              <w:t>DONE</w:t>
             </w:r>
           </w:p>
         </w:tc>
@@ -6485,6 +6527,7 @@
                 <w:b w:val="0"/>
                 <w:sz w:val="20"/>
               </w:rPr>
+              <w:t>Validated by stakeholder's live real-money test (see 3.7): upgrade to Basic -&gt; tier updated correctly.</w:t>
             </w:r>
           </w:p>
         </w:tc>

</xml_diff>

<commit_message>
infra: min-instances=1 + observability for api/webhook (6.1, 7.x)
- cloud_run.tf: min_instance_count 0->1 on api and stripe-webhook (warm
  instance; no cold-start on UX / webhook delivery). Also pin GEOFENCE_ENABLED
  in the api env so terraform apply never wipes the gcloud-set value.
- monitoring_uptime.tf: stripe-webhook /health uptime check + failure alert (7.3).
- monitoring_metrics.tf: log metrics webhook_signature_failure_count (401s the
  5xx alert misses) and gemini_call_failed_count.
- monitoring_alerts.tf: alerts on webhook signature failures (>0/10min, 7.8)
  and Gemini failure bursts (>3/5min, 7.9).
- Checklist: 6.1, 7.1, 7.2, 7.3, 7.8, 7.9 -> DONE.

Applied via targeted terraform apply (6 added, 2 changed); imported the
maxmind-license-key secret into state. Verified minScale=1 both services,
image v10 + GEOFENCE_ENABLED intact.

Co-Authored-By: Claude Opus 4.8 <noreply@anthropic.com>
</commit_message>
<xml_diff>
--- a/PRODUCTION_LAUNCH_CHECKLIST.docx
+++ b/PRODUCTION_LAUNCH_CHECKLIST.docx
@@ -2974,7 +2974,7 @@
                 <w:color w:val="5F6368"/>
                 <w:sz w:val="22"/>
               </w:rPr>
-              <w:t>TODO</w:t>
+              <w:t>DONE</w:t>
             </w:r>
           </w:p>
         </w:tc>
@@ -2989,7 +2989,7 @@
                 <w:b w:val="0"/>
                 <w:sz w:val="20"/>
               </w:rPr>
-              <w:t>Cost: ~$10-15/mo per service. Worth it.</w:t>
+              <w:t>min-instances=1 set on api + stripe-webhook via Terraform (cloud_run.tf); verified minScale=1 both. Cost ~$10-15/mo per service. Rollback: set min_instance_count=0.</w:t>
             </w:r>
           </w:p>
         </w:tc>
@@ -3709,7 +3709,7 @@
                 <w:b w:val="0"/>
                 <w:sz w:val="20"/>
               </w:rPr>
-              <w:t>Shipped for landing on 2026-06-27. Need same for api + stripe-webhook.</w:t>
+              <w:t>Tier 1 alerts now cover api + stripe-webhook: uptime checks, 5xx, p95 latency, plus new webhook-signature and Gemini-failure alerts. All Terraform-managed.</w:t>
             </w:r>
           </w:p>
         </w:tc>
@@ -3757,7 +3757,7 @@
                 <w:color w:val="5F6368"/>
                 <w:sz w:val="22"/>
               </w:rPr>
-              <w:t>TODO</w:t>
+              <w:t>DONE</w:t>
             </w:r>
           </w:p>
         </w:tc>
@@ -3772,7 +3772,7 @@
                 <w:b w:val="0"/>
                 <w:sz w:val="20"/>
               </w:rPr>
-              <w:t>If no healthz endpoint exists, add one.</w:t>
+              <w:t>api /health uptime check + 'uptime check failing' alert (monitoring_uptime.tf). Endpoint is /health (not /healthz).</w:t>
             </w:r>
           </w:p>
         </w:tc>
@@ -3820,7 +3820,7 @@
                 <w:color w:val="5F6368"/>
                 <w:sz w:val="22"/>
               </w:rPr>
-              <w:t>TODO</w:t>
+              <w:t>DONE</w:t>
             </w:r>
           </w:p>
         </w:tc>
@@ -3835,7 +3835,7 @@
                 <w:b w:val="0"/>
                 <w:sz w:val="20"/>
               </w:rPr>
-              <w:t>Webhook failure = silent revenue leak.</w:t>
+              <w:t>stripe-webhook /health uptime check + alert added (monitoring_uptime.tf). Verified /health -&gt; 200.</w:t>
             </w:r>
           </w:p>
         </w:tc>
@@ -4135,7 +4135,7 @@
                 <w:color w:val="5F6368"/>
                 <w:sz w:val="22"/>
               </w:rPr>
-              <w:t>TODO</w:t>
+              <w:t>DONE</w:t>
             </w:r>
           </w:p>
         </w:tc>
@@ -4150,7 +4150,7 @@
                 <w:b w:val="0"/>
                 <w:sz w:val="20"/>
               </w:rPr>
-              <w:t>Indicates compromise attempt.</w:t>
+              <w:t>Log metric webhook_signature_failure_count (event=stripe_webhook_failed + 'signature verification failed', which return 401 so the 5xx alert misses them) + alert &gt;0 in 10min.</w:t>
             </w:r>
           </w:p>
         </w:tc>
@@ -4198,7 +4198,7 @@
                 <w:color w:val="5F6368"/>
                 <w:sz w:val="22"/>
               </w:rPr>
-              <w:t>TODO</w:t>
+              <w:t>DONE</w:t>
             </w:r>
           </w:p>
         </w:tc>
@@ -4213,7 +4213,7 @@
                 <w:b w:val="0"/>
                 <w:sz w:val="20"/>
               </w:rPr>
-              <w:t>Preempt 'all renders failing' outage.</w:t>
+              <w:t>Log metric gemini_call_failed_count (event=gemini_call_failed) + alert &gt;3 in 5min. Broader than only-429: catches any Gemini failure burst ('all renders failing').</w:t>
             </w:r>
           </w:p>
         </w:tc>

</xml_diff>

<commit_message>
feat(obs): wire Cloud Trace via OpenTelemetry auto-instrumentation (7.5)
- api/src/tracing.ts: NodeSDK + auto-instrumentations exporting to Cloud Trace.
  Imported first in index.ts so express/http/firestore get patched. Gated on
  K_SERVICE (Cloud Run only, no-op locally); fs instrumentation disabled;
  flushes on SIGTERM; never crashes the service on setup error.
- cloudtrace.agent role + cloudtrace API were already provisioned (no TF change).
- Deployed on api + stripe-webhook (image v12); otel_tracing_started logged on
  both and traces verified in Cloud Trace.

Co-Authored-By: Claude Opus 4.8 <noreply@anthropic.com>
</commit_message>
<xml_diff>
--- a/PRODUCTION_LAUNCH_CHECKLIST.docx
+++ b/PRODUCTION_LAUNCH_CHECKLIST.docx
@@ -3945,7 +3945,7 @@
                 <w:color w:val="5F6368"/>
                 <w:sz w:val="22"/>
               </w:rPr>
-              <w:t>TODO</w:t>
+              <w:t>DONE</w:t>
             </w:r>
           </w:p>
         </w:tc>
@@ -3960,7 +3960,7 @@
                 <w:b w:val="0"/>
                 <w:sz w:val="20"/>
               </w:rPr>
-              <w:t>NEEDS DECISION: Cloud Trace requires OTel auto-instrumentation in the Node app (code) + has per-span cost. Enable Cloud Trace API + add @google-cloud/opentelemetry when ready. Tier 2.</w:t>
+              <w:t>OTel auto-instrumentation (api/src/tracing.ts, loaded first in index.ts) exporting to Cloud Trace via @google-cloud/opentelemetry-cloud-trace-exporter. Active on Cloud Run only (K_SERVICE gate); fs spans disabled. cloudtrace.agent role + API already provisioned. Live on api + stripe-webhook (image v12); traces verified in Cloud Trace.</w:t>
             </w:r>
           </w:p>
         </w:tc>

</xml_diff>

<commit_message>
docs: reconcile §4 email items to DONE (SendGrid deliverability shipped)
Co-Authored-By: Claude Opus 4.8 <noreply@anthropic.com>
</commit_message>
<xml_diff>
--- a/PRODUCTION_LAUNCH_CHECKLIST.docx
+++ b/PRODUCTION_LAUNCH_CHECKLIST.docx
@@ -1801,8 +1801,7 @@
           <w:color w:val="103366"/>
           <w:sz w:val="28"/>
         </w:rPr>
-        <w:t>4. Firebase Auth &amp; Email Deliverability</w:t>
-        <w:t xml:space="preserve">  </w:t>
+        <w:t xml:space="preserve">4. Firebase Auth &amp; Email Deliverability  </w:t>
       </w:r>
       <w:r>
         <w:rPr>
@@ -1811,7 +1810,7 @@
           <w:color w:val="C5221F"/>
           <w:sz w:val="22"/>
         </w:rPr>
-        <w:t>[BLOCKER]</w:t>
+        <w:t>[DONE except template branding]</w:t>
       </w:r>
     </w:p>
     <w:tbl>
@@ -1936,7 +1935,7 @@
                 <w:color w:val="C5221F"/>
                 <w:sz w:val="22"/>
               </w:rPr>
-              <w:t>BLOCKER</w:t>
+              <w:t>DONE</w:t>
             </w:r>
           </w:p>
         </w:tc>
@@ -1951,7 +1950,7 @@
                 <w:b w:val="0"/>
                 <w:sz w:val="20"/>
               </w:rPr>
-              <w:t>Default email is sent from noreply@prhomzmvp-nonprod.firebaseapp.com and goes to spam. Use SendGrid / Postmark / Mailgun.</w:t>
+              <w:t>Custom SMTP via SendGrid configured in Firebase Auth (smtp.sendgrid.net:587, STARTTLS).</w:t>
             </w:r>
           </w:p>
         </w:tc>
@@ -1999,7 +1998,7 @@
                 <w:color w:val="5F6368"/>
                 <w:sz w:val="22"/>
               </w:rPr>
-              <w:t>TODO</w:t>
+              <w:t>DONE</w:t>
             </w:r>
           </w:p>
         </w:tc>
@@ -2014,7 +2013,7 @@
                 <w:b w:val="0"/>
                 <w:sz w:val="20"/>
               </w:rPr>
-              <w:t>Requires SPF + DKIM on prhomzai.com domain.</w:t>
+              <w:t>From: noreply@prhomzai.com.</w:t>
             </w:r>
           </w:p>
         </w:tc>
@@ -2062,7 +2061,7 @@
                 <w:color w:val="5F6368"/>
                 <w:sz w:val="22"/>
               </w:rPr>
-              <w:t>TODO</w:t>
+              <w:t>DONE</w:t>
             </w:r>
           </w:p>
         </w:tc>
@@ -2077,7 +2076,7 @@
                 <w:b w:val="0"/>
                 <w:sz w:val="20"/>
               </w:rPr>
-              <w:t>Provider-specific.</w:t>
+              <w:t>SPF via SendGrid return-path CNAME (em8669) on GoDaddy.</w:t>
             </w:r>
           </w:p>
         </w:tc>
@@ -2125,7 +2124,7 @@
                 <w:color w:val="5F6368"/>
                 <w:sz w:val="22"/>
               </w:rPr>
-              <w:t>TODO</w:t>
+              <w:t>DONE</w:t>
             </w:r>
           </w:p>
         </w:tc>
@@ -2140,7 +2139,7 @@
                 <w:b w:val="0"/>
                 <w:sz w:val="20"/>
               </w:rPr>
-              <w:t>Provider-specific.</w:t>
+              <w:t>DKIM CNAMEs (s1/s2._domainkey) on GoDaddy, authenticated in SendGrid.</w:t>
             </w:r>
           </w:p>
         </w:tc>
@@ -2188,7 +2187,7 @@
                 <w:color w:val="5F6368"/>
                 <w:sz w:val="22"/>
               </w:rPr>
-              <w:t>TODO</w:t>
+              <w:t>DONE</w:t>
             </w:r>
           </w:p>
         </w:tc>
@@ -2203,6 +2202,7 @@
                 <w:b w:val="0"/>
                 <w:sz w:val="20"/>
               </w:rPr>
+              <w:t>DMARC _dmarc TXT p=none on GoDaddy. Tighten to p=quarantine after ~1 week clean (non-blocking).</w:t>
             </w:r>
           </w:p>
         </w:tc>
@@ -2250,7 +2250,7 @@
                 <w:color w:val="5F6368"/>
                 <w:sz w:val="22"/>
               </w:rPr>
-              <w:t>TODO</w:t>
+              <w:t>PARTIAL</w:t>
             </w:r>
           </w:p>
         </w:tc>
@@ -2265,7 +2265,7 @@
                 <w:b w:val="0"/>
                 <w:sz w:val="20"/>
               </w:rPr>
-              <w:t>Firebase console -&gt; Auth -&gt; Templates.</w:t>
+              <w:t>Signature fixed (PRHOMZ team) + verification link now uses designer.prhomzai.com. Full template branding (logo/colours) still pending, non-blocking.</w:t>
             </w:r>
           </w:p>
         </w:tc>
@@ -2313,7 +2313,7 @@
                 <w:color w:val="5F6368"/>
                 <w:sz w:val="22"/>
               </w:rPr>
-              <w:t>TODO</w:t>
+              <w:t>DONE</w:t>
             </w:r>
           </w:p>
         </w:tc>
@@ -2328,7 +2328,7 @@
                 <w:b w:val="0"/>
                 <w:sz w:val="20"/>
               </w:rPr>
-              <w:t>Use mail-tester.com to score.</w:t>
+              <w:t>Verified: signup verification email lands in Gmail INBOX (not spam) from noreply@prhomzai.com. Note: some receivers (Zoho/prhomz.com) still spam it due to new-domain reputation — receiver-side, improves with age.</w:t>
             </w:r>
           </w:p>
         </w:tc>

</xml_diff>

<commit_message>
docs: §1.1 Shopify token revoked by stakeholder -> DONE (leak fully closed)
Co-Authored-By: Claude Opus 4.8 <noreply@anthropic.com>
</commit_message>
<xml_diff>
--- a/PRODUCTION_LAUNCH_CHECKLIST.docx
+++ b/PRODUCTION_LAUNCH_CHECKLIST.docx
@@ -381,7 +381,7 @@
           </w:tcPr>
           <w:p>
             <w:r>
-              <w:t>PARTIAL</w:t>
+              <w:t>DONE</w:t>
             </w:r>
           </w:p>
         </w:tc>
@@ -391,7 +391,7 @@
           </w:tcPr>
           <w:p>
             <w:r>
-              <w:t>App no longer uses ANY Shopify token — dependency removed (commit 57da1af) and deployed (api + stripe-webhook v8) on 2026-06-29; PRHOMZ Shop-the-Look now just links to prhomz.com. Token still exists in git history. REMAINING: revoke the leaked token in Shopify Admin (now safe — nothing consumes it). Optional: strip the unused SHOPIFY_ACCESS_TOKEN secret binding from cloud_run.tf.</w:t>
+              <w:t>Stakeholder revoked the leaked Shopify Admin token in Shopify Admin (2026-07-16). App already used no Shopify token (removed commit 57da1af), so nothing to redeploy — the credential is now dead.</w:t>
             </w:r>
           </w:p>
         </w:tc>

</xml_diff>

<commit_message>
feat+docs: per-minute render rate-limit (9.3) + production runbook (11.2-11.4)
- lib/quota.ts: anti-abuse burst cap — max 10 renders/rolling-60s per user
  (env GEN_BURST_PER_MIN), enforced inside the existing reserve transaction,
  returns 429 without consuming quota. Applied to proxyGenerateImage + proxyRemodel.
  (9.2 Veo N/A — no video gen exists.)
- RUNBOOK.md: deploy/rollback procedures, --no-traffic canary, launch go/no-go.
- Checklist: 1.5, 9.3, 9.4, 11.2-11.4 DONE; 9.2 N/A; 1.6 PARTIAL (landing SA).
- Live in api image v13 (rev api-00018-w4j).

Co-Authored-By: Claude Opus 4.8 <noreply@anthropic.com>
</commit_message>
<xml_diff>
--- a/PRODUCTION_LAUNCH_CHECKLIST.docx
+++ b/PRODUCTION_LAUNCH_CHECKLIST.docx
@@ -606,7 +606,7 @@
                 <w:color w:val="5F6368"/>
                 <w:sz w:val="22"/>
               </w:rPr>
-              <w:t>TODO</w:t>
+              <w:t>DONE</w:t>
             </w:r>
           </w:p>
         </w:tc>
@@ -621,7 +621,7 @@
                 <w:b w:val="0"/>
                 <w:sz w:val="20"/>
               </w:rPr>
-              <w:t>Inspect frontend dist for firebase-admin or service-account JSON patterns.</w:t>
+              <w:t>Scanned dist/ bundle: no service-account/private-key/sk_live/whsec/shpat patterns. Only public VITE_FIREBASE_ web config embedded (safe by design).</w:t>
             </w:r>
           </w:p>
         </w:tc>
@@ -684,7 +684,7 @@
                 <w:b w:val="0"/>
                 <w:sz w:val="20"/>
               </w:rPr>
-              <w:t>Currently default 352112669414-compute. Ideal: dedicated SA per service.</w:t>
+              <w:t>api + stripe-webhook run as dedicated least-privilege SA cloud-run-runtime@ (NOT default compute). REMAINING: landing service still on default compute SA (352112669414-compute) — needs a minimal SA once we confirm landing makes no privileged GCP calls.</w:t>
             </w:r>
           </w:p>
         </w:tc>
@@ -5049,7 +5049,7 @@
                 <w:color w:val="5F6368"/>
                 <w:sz w:val="22"/>
               </w:rPr>
-              <w:t>TODO</w:t>
+              <w:t>N/A</w:t>
             </w:r>
           </w:p>
         </w:tc>
@@ -5064,7 +5064,7 @@
                 <w:b w:val="0"/>
                 <w:sz w:val="20"/>
               </w:rPr>
-              <w:t>One bad user = hundreds in Veo cost. Add daily cap (e.g., 3 videos/day).</w:t>
+              <w:t>No Veo / video generation exists in the codebase — nothing to rate-limit. Item not applicable.</w:t>
             </w:r>
           </w:p>
         </w:tc>
@@ -5112,7 +5112,7 @@
                 <w:color w:val="5F6368"/>
                 <w:sz w:val="22"/>
               </w:rPr>
-              <w:t>TODO</w:t>
+              <w:t>DONE</w:t>
             </w:r>
           </w:p>
         </w:tc>
@@ -5127,7 +5127,7 @@
                 <w:b w:val="0"/>
                 <w:sz w:val="20"/>
               </w:rPr>
-              <w:t>Beyond the tier quota.</w:t>
+              <w:t>Per-user burst cap added (lib/quota.ts): max 10 renders / rolling 60s across image gen + remodel, on top of tier monthly/daily quota. Env-tunable GEN_BURST_PER_MIN. Returns 429 without consuming quota. Live in image v13.</w:t>
             </w:r>
           </w:p>
         </w:tc>
@@ -5175,7 +5175,7 @@
                 <w:color w:val="5F6368"/>
                 <w:sz w:val="22"/>
               </w:rPr>
-              <w:t>TODO</w:t>
+              <w:t>DONE</w:t>
             </w:r>
           </w:p>
         </w:tc>
@@ -5190,6 +5190,7 @@
                 <w:b w:val="0"/>
                 <w:sz w:val="20"/>
               </w:rPr>
+              <w:t>Cloud Run max-instances: api=10, stripe-webhook=5, landing=10. No Veo, so per-render cost is bounded by these ceilings + the burst cap (9.3).</w:t>
             </w:r>
           </w:p>
         </w:tc>
@@ -6025,7 +6026,7 @@
                 <w:color w:val="5F6368"/>
                 <w:sz w:val="22"/>
               </w:rPr>
-              <w:t>TODO</w:t>
+              <w:t>DONE</w:t>
             </w:r>
           </w:p>
         </w:tc>
@@ -6040,7 +6041,7 @@
                 <w:b w:val="0"/>
                 <w:sz w:val="20"/>
               </w:rPr>
-              <w:t>Write to README or runbook.</w:t>
+              <w:t>Documented in RUNBOOK.md: Cloud Run traffic re-route to prior revision, Firebase hosting:rollback, git revert, and instant env/flag rollback.</w:t>
             </w:r>
           </w:p>
         </w:tc>
@@ -6088,7 +6089,7 @@
                 <w:color w:val="5F6368"/>
                 <w:sz w:val="22"/>
               </w:rPr>
-              <w:t>TODO</w:t>
+              <w:t>DONE</w:t>
             </w:r>
           </w:p>
         </w:tc>
@@ -6103,7 +6104,7 @@
                 <w:b w:val="0"/>
                 <w:sz w:val="20"/>
               </w:rPr>
-              <w:t>Use --no-traffic then update-traffic.</w:t>
+              <w:t>Documented in RUNBOOK.md: deploy --no-traffic then update-traffic --to-latest (canary/pin) so a broken build never auto-serves users.</w:t>
             </w:r>
           </w:p>
         </w:tc>
@@ -6151,7 +6152,7 @@
                 <w:color w:val="5F6368"/>
                 <w:sz w:val="22"/>
               </w:rPr>
-              <w:t>TODO</w:t>
+              <w:t>DONE</w:t>
             </w:r>
           </w:p>
         </w:tc>
@@ -6166,6 +6167,7 @@
                 <w:b w:val="0"/>
                 <w:sz w:val="20"/>
               </w:rPr>
+              <w:t>Go/no-go criteria documented in RUNBOOK.md (§11.4), aligned to the §12 smoke test.</w:t>
             </w:r>
           </w:p>
         </w:tc>

</xml_diff>

<commit_message>
docs: §1.7 email enumeration protection already enabled -> DONE
Co-Authored-By: Claude Opus 4.8 <noreply@anthropic.com>
</commit_message>
<xml_diff>
--- a/PRODUCTION_LAUNCH_CHECKLIST.docx
+++ b/PRODUCTION_LAUNCH_CHECKLIST.docx
@@ -732,7 +732,7 @@
                 <w:color w:val="5F6368"/>
                 <w:sz w:val="22"/>
               </w:rPr>
-              <w:t>TODO</w:t>
+              <w:t>DONE</w:t>
             </w:r>
           </w:p>
         </w:tc>
@@ -747,7 +747,7 @@
                 <w:b w:val="0"/>
                 <w:sz w:val="20"/>
               </w:rPr>
-              <w:t>Firebase console -&gt; Auth -&gt; Settings.</w:t>
+              <w:t>Verified enabled in Firebase Auth -&gt; Settings -&gt; User actions -&gt; Email enumeration protection (recommended). Save greyed out = already active.</w:t>
             </w:r>
           </w:p>
         </w:tc>

</xml_diff>

<commit_message>
docs: §5.4 admin account set (niraj.sriwastava@gmail.com = Admin) -> DONE
Co-Authored-By: Claude Opus 4.8 <noreply@anthropic.com>
</commit_message>
<xml_diff>
--- a/PRODUCTION_LAUNCH_CHECKLIST.docx
+++ b/PRODUCTION_LAUNCH_CHECKLIST.docx
@@ -2674,7 +2674,7 @@
                 <w:color w:val="5F6368"/>
                 <w:sz w:val="22"/>
               </w:rPr>
-              <w:t>TODO</w:t>
+              <w:t>DONE</w:t>
             </w:r>
           </w:p>
         </w:tc>
@@ -2689,7 +2689,7 @@
                 <w:b w:val="0"/>
                 <w:sz w:val="20"/>
               </w:rPr>
-              <w:t>Hard to recover if forgotten.</w:t>
+              <w:t>niraj.sriwastava@gmail.com set to role=Admin (uid gf0dnIfMo5akjm3SLICa6CDgQRN2) via admin SDK. Admin nav tab + dashboard now available on that account.</w:t>
             </w:r>
           </w:p>
         </w:tc>

</xml_diff>

<commit_message>
docs: §3.6 Stripe Customer Portal configured (live) -> DONE
Co-Authored-By: Claude Opus 4.8 <noreply@anthropic.com>
</commit_message>
<xml_diff>
--- a/PRODUCTION_LAUNCH_CHECKLIST.docx
+++ b/PRODUCTION_LAUNCH_CHECKLIST.docx
@@ -1652,7 +1652,7 @@
           </w:tcPr>
           <w:p>
             <w:r>
-              <w:t>PARTIAL</w:t>
+              <w:t>DONE</w:t>
             </w:r>
           </w:p>
         </w:tc>
@@ -1662,7 +1662,7 @@
           </w:tcPr>
           <w:p>
             <w:r>
-              <w:t>Activated during setup; confirm live-mode branding, allowed plan switches, and cancellation flow.</w:t>
+              <w:t>Live-mode Customer Portal configured: cancellation at end of billing period; switch plans ON with all 3 products (Basic/Advanced/Designer); prorated charges/credits; payment-method + invoice history on. Saved 2026-07-16.</w:t>
             </w:r>
           </w:p>
         </w:tc>

</xml_diff>

<commit_message>
docs: mark 7.6 Sentry frontend error tracking DONE (DSN wired + deployed)
Co-Authored-By: Claude Opus 4.8 <noreply@anthropic.com>
</commit_message>
<xml_diff>
--- a/PRODUCTION_LAUNCH_CHECKLIST.docx
+++ b/PRODUCTION_LAUNCH_CHECKLIST.docx
@@ -4008,7 +4008,7 @@
                 <w:color w:val="5F6368"/>
                 <w:sz w:val="22"/>
               </w:rPr>
-              <w:t>TODO</w:t>
+              <w:t>DONE</w:t>
             </w:r>
           </w:p>
         </w:tc>
@@ -4023,7 +4023,7 @@
                 <w:b w:val="0"/>
                 <w:sz w:val="20"/>
               </w:rPr>
-              <w:t>NEEDS EXTERNAL ACCOUNT: create a Sentry (or similar) project and provide the DSN, then wire the browser SDK. No native Firebase Crashlytics for web. Tier 3.</w:t>
+              <w:t>Sentry React project created (prhomz-designer); DSN wired in services/sentry.ts, env-gated on VITE_SENTRY_DSN. Live in designer app bundle + deployed. Session replay on error, source-mapped. Landing site deferred post-launch.</w:t>
             </w:r>
           </w:p>
         </w:tc>

</xml_diff>

<commit_message>
docs: landing apex prhomzai.com live (2.2/2.5); memory updates
Co-Authored-By: Claude Opus 4.8 <noreply@anthropic.com>
</commit_message>
<xml_diff>
--- a/PRODUCTION_LAUNCH_CHECKLIST.docx
+++ b/PRODUCTION_LAUNCH_CHECKLIST.docx
@@ -958,7 +958,7 @@
                 <w:color w:val="5F6368"/>
                 <w:sz w:val="22"/>
               </w:rPr>
-              <w:t>TODO</w:t>
+              <w:t>DONE (apex; www pending)</w:t>
             </w:r>
           </w:p>
         </w:tc>
@@ -973,7 +973,7 @@
                 <w:b w:val="0"/>
                 <w:sz w:val="20"/>
               </w:rPr>
-              <w:t>gcloud beta run domain-mappings create</w:t>
+              <w:t>prhomzai.com apex LIVE via Firebase Hosting multi-site rewrite to Cloud Run landing service (not a raw Cloud Run domain mapping). HTTPS 200, cert provisioned, x-cloud-trace-context confirms it hits Cloud Run. www.prhomzai.com redirect still to add (see 2.6). Cosmetic: landing &lt;title&gt; still 'My Google AI Studio App' - stakeholder to rebrand.</w:t>
             </w:r>
           </w:p>
         </w:tc>
@@ -1140,7 +1140,7 @@
           </w:tcPr>
           <w:p>
             <w:r>
-              <w:t>HTTPS cert auto-provisioned for designer.prhomzai.com (verified serving).</w:t>
+              <w:t>HTTPS cert auto-provisioned for BOTH designer.prhomzai.com AND prhomzai.com apex (both verified serving 200 on 2026-07-16).</w:t>
             </w:r>
           </w:p>
         </w:tc>

</xml_diff>

<commit_message>
docs: 2.6 www.prhomzai.com DNS configured, cert provisioning
Co-Authored-By: Claude Opus 4.8 <noreply@anthropic.com>
</commit_message>
<xml_diff>
--- a/PRODUCTION_LAUNCH_CHECKLIST.docx
+++ b/PRODUCTION_LAUNCH_CHECKLIST.docx
@@ -1188,7 +1188,7 @@
                 <w:color w:val="5F6368"/>
                 <w:sz w:val="22"/>
               </w:rPr>
-              <w:t>TODO</w:t>
+              <w:t>IN PROGRESS (DNS done)</w:t>
             </w:r>
           </w:p>
         </w:tc>
@@ -1203,7 +1203,7 @@
                 <w:b w:val="0"/>
                 <w:sz w:val="20"/>
               </w:rPr>
-              <w:t>Decide canonical host.</w:t>
+              <w:t>www.prhomzai.com added as custom domain on Firebase Hosting landing site (prhomz-landing). GoDaddy CNAME updated: www -&gt; prhomz-landing.web.app (old www-&gt;prhomzai.com removed); authoritative DNS confirmed via 8.8.8.8. Firebase cert auto-provisioning (was 'not yet detected' - normal lag, auto-retries). www SERVES landing (same content as apex), not a 301 redirect - fine for launch; strict www-&gt;apex canonical redirect deferred post-launch.</w:t>
             </w:r>
           </w:p>
         </w:tc>

</xml_diff>

<commit_message>
docs: mark 2.4 DONE - landing Designer links now point to designer.prhomzai.com
Co-Authored-By: Claude Opus 4.8 <noreply@anthropic.com>
</commit_message>
<xml_diff>
--- a/PRODUCTION_LAUNCH_CHECKLIST.docx
+++ b/PRODUCTION_LAUNCH_CHECKLIST.docx
@@ -1073,7 +1073,7 @@
                 <w:color w:val="5F6368"/>
                 <w:sz w:val="22"/>
               </w:rPr>
-              <w:t>TODO</w:t>
+              <w:t>DONE</w:t>
             </w:r>
           </w:p>
         </w:tc>
@@ -1088,7 +1088,7 @@
                 <w:b w:val="0"/>
                 <w:sz w:val="20"/>
               </w:rPr>
-              <w:t>One-line change. Redeploy as v3.</w:t>
+              <w:t>All 4 Designer CTA links updated to https://designer.prhomzai.com/ (App.tsx x3 + PricingSubscription.tsx x1) - not just line 116. Landing rebuilt v6, deployed (rev landing-00014-g4p), verified: live bundle has 4 designer.prhomzai.com refs, 0 old prhomzmvp-nonprod refs.</w:t>
             </w:r>
           </w:p>
         </w:tc>

</xml_diff>

<commit_message>
docs: 2.6 www.prhomzai.com live with valid cert - DONE
Co-Authored-By: Claude Opus 4.8 <noreply@anthropic.com>
</commit_message>
<xml_diff>
--- a/PRODUCTION_LAUNCH_CHECKLIST.docx
+++ b/PRODUCTION_LAUNCH_CHECKLIST.docx
@@ -1188,7 +1188,7 @@
                 <w:color w:val="5F6368"/>
                 <w:sz w:val="22"/>
               </w:rPr>
-              <w:t>IN PROGRESS (DNS done)</w:t>
+              <w:t>DONE</w:t>
             </w:r>
           </w:p>
         </w:tc>
@@ -1203,7 +1203,7 @@
                 <w:b w:val="0"/>
                 <w:sz w:val="20"/>
               </w:rPr>
-              <w:t>www.prhomzai.com added as custom domain on Firebase Hosting landing site (prhomz-landing). GoDaddy CNAME updated: www -&gt; prhomz-landing.web.app (old www-&gt;prhomzai.com removed); authoritative DNS confirmed via 8.8.8.8. Firebase cert auto-provisioning (was 'not yet detected' - normal lag, auto-retries). www SERVES landing (same content as apex), not a 301 redirect - fine for launch; strict www-&gt;apex canonical redirect deferred post-launch.</w:t>
+              <w:t>www.prhomzai.com LIVE: HTTPS 200, valid Google Trust Services cert (CN=www.prhomzai.com, valid Jul 16-Oct 14 2026), serves landing page. All 3 domains live: apex, www, designer. www SERVES landing (same as apex), not a 301 redirect - fine for launch; strict canonical www-&gt;apex redirect deferred post-launch.</w:t>
             </w:r>
           </w:p>
         </w:tc>

</xml_diff>

<commit_message>
docs: 2.2 DONE (www live); record landing rebrand (title/meta/OG, v7)
Co-Authored-By: Claude Opus 4.8 <noreply@anthropic.com>
</commit_message>
<xml_diff>
--- a/PRODUCTION_LAUNCH_CHECKLIST.docx
+++ b/PRODUCTION_LAUNCH_CHECKLIST.docx
@@ -958,7 +958,7 @@
                 <w:color w:val="5F6368"/>
                 <w:sz w:val="22"/>
               </w:rPr>
-              <w:t>DONE (apex; www pending)</w:t>
+              <w:t>DONE</w:t>
             </w:r>
           </w:p>
         </w:tc>
@@ -973,7 +973,7 @@
                 <w:b w:val="0"/>
                 <w:sz w:val="20"/>
               </w:rPr>
-              <w:t>prhomzai.com apex LIVE via Firebase Hosting multi-site rewrite to Cloud Run landing service (not a raw Cloud Run domain mapping). HTTPS 200, cert provisioned, x-cloud-trace-context confirms it hits Cloud Run. www.prhomzai.com redirect still to add (see 2.6). Cosmetic: landing &lt;title&gt; still 'My Google AI Studio App' - stakeholder to rebrand.</w:t>
+              <w:t>prhomzai.com apex LIVE via Firebase Hosting multi-site rewrite to Cloud Run landing service (not a raw Cloud Run domain mapping). HTTPS 200, cert provisioned, x-cloud-trace-context confirms it hits Cloud Run. www.prhomzai.com now LIVE too (see 2.6). Cosmetic: landing &lt;title&gt; still 'My Google AI Studio App' - stakeholder to rebrand. LANDING REBRAND (v7, rev landing-00015-6jz): &lt;title&gt; now 'PRHOMZ AI | Redesign Your Home with AI' + meta description + OG/Twitter cards + canonical. Favicon + og:image (need brand logo) = small follow-up.</w:t>
             </w:r>
           </w:p>
         </w:tc>

</xml_diff>

<commit_message>
docs: 1.3 DONE - landing repo secret hygiene verified
Co-Authored-By: Claude Opus 4.8 <noreply@anthropic.com>
</commit_message>
<xml_diff>
--- a/PRODUCTION_LAUNCH_CHECKLIST.docx
+++ b/PRODUCTION_LAUNCH_CHECKLIST.docx
@@ -485,7 +485,7 @@
           </w:tcPr>
           <w:p>
             <w:r>
-              <w:t>PARTIAL</w:t>
+              <w:t>DONE</w:t>
             </w:r>
           </w:p>
         </w:tc>
@@ -495,7 +495,7 @@
           </w:tcPr>
           <w:p>
             <w:r>
-              <w:t>DESIGNER repo confirmed: api/.secret.local is gitignored and 0 commits touch it. Still verify PRHOMZ-AI-LANDING repo.</w:t>
+              <w:t>BOTH repos confirmed. DESIGNER: api/.secret.local gitignored, 0 commits touch it. LANDING: .env* gitignored (only .env.example tracked = placeholders MY_GEMINI_API_KEY/MY_APP_URL, no real secrets); no secret/key/serviceaccount files tracked.</w:t>
             </w:r>
           </w:p>
         </w:tc>

</xml_diff>

<commit_message>
docs: 3.8 + 8.8 DONE (Stripe dispute email monitored; refund policy finalised)
Co-Authored-By: Claude Opus 4.8 <noreply@anthropic.com>
</commit_message>
<xml_diff>
--- a/PRODUCTION_LAUNCH_CHECKLIST.docx
+++ b/PRODUCTION_LAUNCH_CHECKLIST.docx
@@ -1762,7 +1762,7 @@
                 <w:color w:val="5F6368"/>
                 <w:sz w:val="22"/>
               </w:rPr>
-              <w:t>TODO</w:t>
+              <w:t>DONE</w:t>
             </w:r>
           </w:p>
         </w:tc>
@@ -1777,7 +1777,7 @@
                 <w:b w:val="0"/>
                 <w:sz w:val="20"/>
               </w:rPr>
-              <w:t>Defaults to Stripe account email.</w:t>
+              <w:t>Stripe dispute/chargeback alerts go to the Stripe account email, which Niraj confirmed is a monitored inbox. No separate forwarding needed.</w:t>
             </w:r>
           </w:p>
         </w:tc>
@@ -4812,7 +4812,7 @@
                 <w:color w:val="5F6368"/>
                 <w:sz w:val="22"/>
               </w:rPr>
-              <w:t>TODO</w:t>
+              <w:t>DONE</w:t>
             </w:r>
           </w:p>
         </w:tc>
@@ -4827,7 +4827,7 @@
                 <w:b w:val="0"/>
                 <w:sz w:val="20"/>
               </w:rPr>
-              <w:t>Currently T&amp;C says 'no refund for current period'.</w:t>
+              <w:t>Refund policy FINALISED: no refund for the current billing period (as stated in T&amp;C). Confirmed by Niraj 2026-07-16 as the final policy.</w:t>
             </w:r>
           </w:p>
         </w:tc>

</xml_diff>

<commit_message>
docs: 1.6 DONE - landing on dedicated least-priv SA (landing-runtime@)
Co-Authored-By: Claude Opus 4.8 <noreply@anthropic.com>
</commit_message>
<xml_diff>
--- a/PRODUCTION_LAUNCH_CHECKLIST.docx
+++ b/PRODUCTION_LAUNCH_CHECKLIST.docx
@@ -669,7 +669,7 @@
                 <w:color w:val="B76E00"/>
                 <w:sz w:val="22"/>
               </w:rPr>
-              <w:t>PARTIAL</w:t>
+              <w:t>DONE</w:t>
             </w:r>
           </w:p>
         </w:tc>
@@ -684,7 +684,7 @@
                 <w:b w:val="0"/>
                 <w:sz w:val="20"/>
               </w:rPr>
-              <w:t>api + stripe-webhook run as dedicated least-privilege SA cloud-run-runtime@ (NOT default compute). REMAINING: landing service still on default compute SA (352112669414-compute) — needs a minimal SA once we confirm landing makes no privileged GCP calls.</w:t>
+              <w:t>ALL 3 services now on dedicated least-privilege SAs. api + stripe-webhook = cloud-run-runtime@. landing NOW = landing-runtime@ (created 2026-07-16, secretmanager.secretAccessor on ONLY gemini-api-key + gmail-app-password, plus logWriter/metricWriter). Verified landing makes no privileged GCP IAM calls (uses @google/genai API key + Gmail SMTP, no firebase-admin/@google-cloud SDKs). Canary-deployed (--no-traffic tag lpsa), verified 200 + endpoints, then migrated 100% traffic to rev landing-00016-yaz. Off default compute SA.</w:t>
             </w:r>
           </w:p>
         </w:tc>

</xml_diff>

<commit_message>
docs: 6.10 - document monthly MaxMind DB refresh procedure in RUNBOOK
Co-Authored-By: Claude Opus 4.8 <noreply@anthropic.com>
</commit_message>
<xml_diff>
--- a/PRODUCTION_LAUNCH_CHECKLIST.docx
+++ b/PRODUCTION_LAUNCH_CHECKLIST.docx
@@ -3524,7 +3524,7 @@
           </w:tcPr>
           <w:p>
             <w:r>
-              <w:t>TODO</w:t>
+              <w:t>DONE (documented procedure)</w:t>
             </w:r>
           </w:p>
         </w:tc>
@@ -3534,7 +3534,7 @@
           </w:tcPr>
           <w:p>
             <w:r>
-              <w:t>DB is baked in at build time (cloudbuild.yaml downloads from maxmind-license-key secret). Country data drifts slowly, so monthly is ample. Automate via Cloud Scheduler-triggered rebuild or a monthly manual 'gcloud builds submit'.</w:t>
+              <w:t>Monthly refresh procedure documented in RUNBOOK.md ('Monthly maintenance' section): rebuild api via api/cloudbuild.yaml (re-downloads latest GeoLite2 from maxmind-license-key secret) + redeploy + verify /geo. Set a monthly calendar reminder. Full unattended Scheduler-&gt;Build auto-redeploy of core api intentionally deferred (risk of unattended auto-deploy &gt; benefit; geofence fails open). Country data drifts slowly so monthly manual is ample.</w:t>
             </w:r>
           </w:p>
         </w:tc>

</xml_diff>

<commit_message>
docs: 5.6 - document Firestore backup + restore procedure in RUNBOOK
Co-Authored-By: Claude Opus 4.8 <noreply@anthropic.com>
</commit_message>
<xml_diff>
--- a/PRODUCTION_LAUNCH_CHECKLIST.docx
+++ b/PRODUCTION_LAUNCH_CHECKLIST.docx
@@ -2800,7 +2800,7 @@
                 <w:color w:val="5F6368"/>
                 <w:sz w:val="22"/>
               </w:rPr>
-              <w:t>TODO</w:t>
+              <w:t>DONE</w:t>
             </w:r>
           </w:p>
         </w:tc>
@@ -2815,7 +2815,7 @@
                 <w:b w:val="0"/>
                 <w:sz w:val="20"/>
               </w:rPr>
-              <w:t>Manual gcloud firestore export cadence or scheduled.</w:t>
+              <w:t>Documented in RUNBOOK.md ('Firestore backups &amp; restore'). Automated daily backup schedule + 7-day retention already live (firestore.tf); verified 1 backup READY (snapshot 2026-07-16). Procedure covers: list schedules/backups, restore-to-new-DB (incident recovery), manual GCS export/import for longer retention.</w:t>
             </w:r>
           </w:p>
         </w:tc>

</xml_diff>

<commit_message>
docs: 4.6 finalized - keep SendGrid, defer link branding post-launch (documented tradeoff)
Co-Authored-By: Claude Opus 4.8 <noreply@anthropic.com>
</commit_message>
<xml_diff>
--- a/PRODUCTION_LAUNCH_CHECKLIST.docx
+++ b/PRODUCTION_LAUNCH_CHECKLIST.docx
@@ -2250,7 +2250,7 @@
                 <w:color w:val="5F6368"/>
                 <w:sz w:val="22"/>
               </w:rPr>
-              <w:t>PARTIAL</w:t>
+              <w:t>DONE (link branding deferred, documented)</w:t>
             </w:r>
           </w:p>
         </w:tc>
@@ -2265,7 +2265,7 @@
                 <w:b w:val="0"/>
                 <w:sz w:val="20"/>
               </w:rPr>
-              <w:t>DEFINITIVE DIAGNOSIS 2026-07-19: email action-URL (callbackUri) CANNOT be set to custom domain designer.prhomzai.com - Firebase rejects with EMAIL_TEMPLATE_UPDATE_NOT_ALLOWED. Proven: callbackUri accepts ONLY Firebase-default domains (*.web.app/*.firebaseapp.com set fine); custom domains require the separate 'custom domain for email action links' DNS-verification flow (dnsInfo.customDomainState=NOT_STARTED). NOT a time cooldown (persisted 40h+) and NOT email-privacy (disabling didn't help; restored). Template subject/sender edits DO work. Consequence: verification emails show prhomzmvp-nonprod.firebaseapp.com (exposes 'nonprod' since prod = same project). Template body/sender/signature branding already done (SendGrid noreply@prhomzai.com). DECISION PENDING: accept for launch vs pursue custom-domain-for-email flow.</w:t>
+              <w:t>DECISION 2026-07-19: KEEP SendGrid custom SMTP (noreply@prhomzai.com, tested in-inbox). Verification/reset email BODY link stays https://prhomzmvp-nonprod.firebaseapp.com/__/auth/action (functional; cosmetic). WHY not branded: Firebase only brands the action-link domain via the 'Custom domain for email templates' wizard, which (a) REPLACES custom SMTP with Firebase-native sending (firebasemail.com SPF/DKIM) - would abandon tested SendGrid deliverability 6 days pre-launch, and (b) requires TXT records on designer.prhomzai.com which is a CNAME (hosting) -&gt; hard DNS conflict. Not worth risking deliverability + hosting for a cosmetic link. POST-LAUNCH option: Firebase-native custom-domain email on a NON-CNAME domain (e.g. mail.prhomzai.com), migrated off SendGrid with deliverability testing. Sender/signature branding already DONE.</w:t>
             </w:r>
           </w:p>
         </w:tc>

</xml_diff>